<commit_message>
se agrego tabla de verdad funcional
</commit_message>
<xml_diff>
--- a/parte1.docx
+++ b/parte1.docx
@@ -983,6 +983,494 @@
         <w:t xml:space="preserve"> = r[i]</w:t>
       </w:r>
     </w:p>
+    <w:p>
+      <w:r>
+        <w:t xml:space="preserve">tv = [[0]*4 </w:t>
+      </w:r>
+      <w:proofErr w:type="spellStart"/>
+      <w:r>
+        <w:t>for</w:t>
+      </w:r>
+      <w:proofErr w:type="spellEnd"/>
+      <w:r>
+        <w:t xml:space="preserve"> _ in </w:t>
+      </w:r>
+      <w:proofErr w:type="spellStart"/>
+      <w:r>
+        <w:t>range</w:t>
+      </w:r>
+      <w:proofErr w:type="spellEnd"/>
+      <w:r>
+        <w:t>(8)]</w:t>
+      </w:r>
+      <w:r>
+        <w:br/>
+        <w:t>tv2 = [0]*4</w:t>
+      </w:r>
+      <w:r>
+        <w:br/>
+      </w:r>
+      <w:proofErr w:type="spellStart"/>
+      <w:r>
+        <w:t>print</w:t>
+      </w:r>
+      <w:proofErr w:type="spellEnd"/>
+      <w:r>
+        <w:t>("1-true, 2-false")</w:t>
+      </w:r>
+      <w:r>
+        <w:br/>
+      </w:r>
+      <w:r>
+        <w:br/>
+      </w:r>
+      <w:proofErr w:type="spellStart"/>
+      <w:r>
+        <w:t>print</w:t>
+      </w:r>
+      <w:proofErr w:type="spellEnd"/>
+      <w:r>
+        <w:t>("p   q   r   (</w:t>
+      </w:r>
+      <w:proofErr w:type="spellStart"/>
+      <w:r>
+        <w:t>pVq</w:t>
+      </w:r>
+      <w:proofErr w:type="spellEnd"/>
+      <w:r>
+        <w:t>)</w:t>
+      </w:r>
+      <w:proofErr w:type="spellStart"/>
+      <w:r>
+        <w:t>nr</w:t>
+      </w:r>
+      <w:proofErr w:type="spellEnd"/>
+      <w:r>
+        <w:t>")</w:t>
+      </w:r>
+      <w:r>
+        <w:br/>
+      </w:r>
+      <w:proofErr w:type="spellStart"/>
+      <w:r>
+        <w:t>for</w:t>
+      </w:r>
+      <w:proofErr w:type="spellEnd"/>
+      <w:r>
+        <w:t xml:space="preserve"> col in </w:t>
+      </w:r>
+      <w:proofErr w:type="spellStart"/>
+      <w:r>
+        <w:t>range</w:t>
+      </w:r>
+      <w:proofErr w:type="spellEnd"/>
+      <w:r>
+        <w:t>(4):</w:t>
+      </w:r>
+      <w:r>
+        <w:br/>
+        <w:t xml:space="preserve">    tv[0][col] = 1</w:t>
+      </w:r>
+      <w:r>
+        <w:br/>
+      </w:r>
+      <w:proofErr w:type="spellStart"/>
+      <w:r>
+        <w:t>for</w:t>
+      </w:r>
+      <w:proofErr w:type="spellEnd"/>
+      <w:r>
+        <w:t xml:space="preserve"> col in </w:t>
+      </w:r>
+      <w:proofErr w:type="spellStart"/>
+      <w:r>
+        <w:t>range</w:t>
+      </w:r>
+      <w:proofErr w:type="spellEnd"/>
+      <w:r>
+        <w:t>(4):</w:t>
+      </w:r>
+      <w:r>
+        <w:br/>
+        <w:t xml:space="preserve">    tv[1][col] = 1</w:t>
+      </w:r>
+      <w:r>
+        <w:br/>
+        <w:t>tv[1][0] = 2</w:t>
+      </w:r>
+      <w:r>
+        <w:br/>
+      </w:r>
+      <w:proofErr w:type="spellStart"/>
+      <w:r>
+        <w:t>for</w:t>
+      </w:r>
+      <w:proofErr w:type="spellEnd"/>
+      <w:r>
+        <w:t xml:space="preserve"> col in </w:t>
+      </w:r>
+      <w:proofErr w:type="spellStart"/>
+      <w:r>
+        <w:t>range</w:t>
+      </w:r>
+      <w:proofErr w:type="spellEnd"/>
+      <w:r>
+        <w:t>(4):</w:t>
+      </w:r>
+      <w:r>
+        <w:br/>
+        <w:t xml:space="preserve">    tv[2][col] = 1</w:t>
+      </w:r>
+      <w:r>
+        <w:br/>
+        <w:t>tv[2][1] = 2</w:t>
+      </w:r>
+      <w:r>
+        <w:br/>
+      </w:r>
+      <w:proofErr w:type="spellStart"/>
+      <w:r>
+        <w:t>for</w:t>
+      </w:r>
+      <w:proofErr w:type="spellEnd"/>
+      <w:r>
+        <w:t xml:space="preserve"> col in </w:t>
+      </w:r>
+      <w:proofErr w:type="spellStart"/>
+      <w:r>
+        <w:t>range</w:t>
+      </w:r>
+      <w:proofErr w:type="spellEnd"/>
+      <w:r>
+        <w:t>(4):</w:t>
+      </w:r>
+      <w:r>
+        <w:br/>
+        <w:t xml:space="preserve">    tv[3][col] = 1</w:t>
+      </w:r>
+      <w:r>
+        <w:br/>
+        <w:t>tv[3][2] = 2</w:t>
+      </w:r>
+      <w:r>
+        <w:br/>
+      </w:r>
+      <w:proofErr w:type="spellStart"/>
+      <w:r>
+        <w:lastRenderedPageBreak/>
+        <w:t>for</w:t>
+      </w:r>
+      <w:proofErr w:type="spellEnd"/>
+      <w:r>
+        <w:t xml:space="preserve"> col in </w:t>
+      </w:r>
+      <w:proofErr w:type="spellStart"/>
+      <w:r>
+        <w:t>range</w:t>
+      </w:r>
+      <w:proofErr w:type="spellEnd"/>
+      <w:r>
+        <w:t>(4):</w:t>
+      </w:r>
+      <w:r>
+        <w:br/>
+        <w:t xml:space="preserve">    tv[4][col] = 1</w:t>
+      </w:r>
+      <w:r>
+        <w:br/>
+        <w:t>tv[4][0] = 2</w:t>
+      </w:r>
+      <w:r>
+        <w:br/>
+        <w:t>tv[4][1] = 2</w:t>
+      </w:r>
+      <w:r>
+        <w:br/>
+      </w:r>
+      <w:proofErr w:type="spellStart"/>
+      <w:r>
+        <w:t>for</w:t>
+      </w:r>
+      <w:proofErr w:type="spellEnd"/>
+      <w:r>
+        <w:t xml:space="preserve"> col in </w:t>
+      </w:r>
+      <w:proofErr w:type="spellStart"/>
+      <w:r>
+        <w:t>range</w:t>
+      </w:r>
+      <w:proofErr w:type="spellEnd"/>
+      <w:r>
+        <w:t>(4):</w:t>
+      </w:r>
+      <w:r>
+        <w:br/>
+        <w:t xml:space="preserve">    tv[5][col] = 1</w:t>
+      </w:r>
+      <w:r>
+        <w:br/>
+        <w:t>tv[5][1] = 2</w:t>
+      </w:r>
+      <w:r>
+        <w:br/>
+        <w:t>tv[5][2] = 2</w:t>
+      </w:r>
+      <w:r>
+        <w:br/>
+        <w:t>tv[5][3] = 2</w:t>
+      </w:r>
+      <w:r>
+        <w:br/>
+      </w:r>
+      <w:proofErr w:type="spellStart"/>
+      <w:r>
+        <w:t>for</w:t>
+      </w:r>
+      <w:proofErr w:type="spellEnd"/>
+      <w:r>
+        <w:t xml:space="preserve"> col in </w:t>
+      </w:r>
+      <w:proofErr w:type="spellStart"/>
+      <w:r>
+        <w:t>range</w:t>
+      </w:r>
+      <w:proofErr w:type="spellEnd"/>
+      <w:r>
+        <w:t>(4):</w:t>
+      </w:r>
+      <w:r>
+        <w:br/>
+        <w:t xml:space="preserve">    tv[6][col] = 1</w:t>
+      </w:r>
+      <w:r>
+        <w:br/>
+        <w:t>tv[6][0] = 2</w:t>
+      </w:r>
+      <w:r>
+        <w:br/>
+        <w:t>tv[6][2] = 2</w:t>
+      </w:r>
+      <w:r>
+        <w:br/>
+        <w:t>tv[6][3] = 2</w:t>
+      </w:r>
+      <w:r>
+        <w:br/>
+      </w:r>
+      <w:proofErr w:type="spellStart"/>
+      <w:r>
+        <w:t>for</w:t>
+      </w:r>
+      <w:proofErr w:type="spellEnd"/>
+      <w:r>
+        <w:t xml:space="preserve"> col in </w:t>
+      </w:r>
+      <w:proofErr w:type="spellStart"/>
+      <w:r>
+        <w:t>range</w:t>
+      </w:r>
+      <w:proofErr w:type="spellEnd"/>
+      <w:r>
+        <w:t>(4):</w:t>
+      </w:r>
+      <w:r>
+        <w:br/>
+        <w:t xml:space="preserve">    tv[7][col] = 2</w:t>
+      </w:r>
+      <w:r>
+        <w:br/>
+      </w:r>
+      <w:proofErr w:type="spellStart"/>
+      <w:r>
+        <w:t>for</w:t>
+      </w:r>
+      <w:proofErr w:type="spellEnd"/>
+      <w:r>
+        <w:t xml:space="preserve"> i in </w:t>
+      </w:r>
+      <w:proofErr w:type="spellStart"/>
+      <w:r>
+        <w:t>range</w:t>
+      </w:r>
+      <w:proofErr w:type="spellEnd"/>
+      <w:r>
+        <w:t>(8):</w:t>
+      </w:r>
+      <w:r>
+        <w:br/>
+        <w:t xml:space="preserve">    </w:t>
+      </w:r>
+      <w:proofErr w:type="spellStart"/>
+      <w:r>
+        <w:t>print</w:t>
+      </w:r>
+      <w:proofErr w:type="spellEnd"/>
+      <w:r>
+        <w:t>(tv[i])</w:t>
+      </w:r>
+      <w:r>
+        <w:br/>
+      </w:r>
+      <w:proofErr w:type="spellStart"/>
+      <w:r>
+        <w:t>print</w:t>
+      </w:r>
+      <w:proofErr w:type="spellEnd"/>
+      <w:r>
+        <w:t>("tabla de verdad funcional")</w:t>
+      </w:r>
+      <w:r>
+        <w:br/>
+      </w:r>
+      <w:proofErr w:type="spellStart"/>
+      <w:r>
+        <w:t>for</w:t>
+      </w:r>
+      <w:proofErr w:type="spellEnd"/>
+      <w:r>
+        <w:t xml:space="preserve"> i in </w:t>
+      </w:r>
+      <w:proofErr w:type="spellStart"/>
+      <w:r>
+        <w:t>range</w:t>
+      </w:r>
+      <w:proofErr w:type="spellEnd"/>
+      <w:r>
+        <w:t>(3):</w:t>
+      </w:r>
+      <w:r>
+        <w:br/>
+        <w:t xml:space="preserve">    o = </w:t>
+      </w:r>
+      <w:proofErr w:type="spellStart"/>
+      <w:r>
+        <w:t>int</w:t>
+      </w:r>
+      <w:proofErr w:type="spellEnd"/>
+      <w:r>
+        <w:t>(input("ingrese 1 para true, 2 para false: "))</w:t>
+      </w:r>
+      <w:r>
+        <w:br/>
+        <w:t xml:space="preserve">    </w:t>
+      </w:r>
+      <w:proofErr w:type="spellStart"/>
+      <w:r>
+        <w:t>while</w:t>
+      </w:r>
+      <w:proofErr w:type="spellEnd"/>
+      <w:r>
+        <w:t xml:space="preserve"> o&lt;=0 </w:t>
+      </w:r>
+      <w:proofErr w:type="spellStart"/>
+      <w:r>
+        <w:t>or</w:t>
+      </w:r>
+      <w:proofErr w:type="spellEnd"/>
+      <w:r>
+        <w:t xml:space="preserve"> o&gt;2:</w:t>
+      </w:r>
+      <w:r>
+        <w:br/>
+        <w:t xml:space="preserve">        </w:t>
+      </w:r>
+      <w:proofErr w:type="spellStart"/>
+      <w:r>
+        <w:t>print</w:t>
+      </w:r>
+      <w:proofErr w:type="spellEnd"/>
+      <w:r>
+        <w:t>("digito incorrecto")</w:t>
+      </w:r>
+      <w:r>
+        <w:br/>
+        <w:t xml:space="preserve">        o = </w:t>
+      </w:r>
+      <w:proofErr w:type="spellStart"/>
+      <w:r>
+        <w:t>int</w:t>
+      </w:r>
+      <w:proofErr w:type="spellEnd"/>
+      <w:r>
+        <w:t>(input("ingrese 1 para true, 2 para false: "))</w:t>
+      </w:r>
+      <w:r>
+        <w:br/>
+        <w:t xml:space="preserve">    tv2[i] = o</w:t>
+      </w:r>
+      <w:r>
+        <w:br/>
+      </w:r>
+      <w:proofErr w:type="spellStart"/>
+      <w:r>
+        <w:t>if</w:t>
+      </w:r>
+      <w:proofErr w:type="spellEnd"/>
+      <w:r>
+        <w:t xml:space="preserve"> tv2[0] == 1 and tv2[1] == 1:</w:t>
+      </w:r>
+      <w:r>
+        <w:br/>
+        <w:t xml:space="preserve">    z = 1</w:t>
+      </w:r>
+      <w:r>
+        <w:br/>
+      </w:r>
+      <w:proofErr w:type="spellStart"/>
+      <w:r>
+        <w:t>else</w:t>
+      </w:r>
+      <w:proofErr w:type="spellEnd"/>
+      <w:r>
+        <w:t>:</w:t>
+      </w:r>
+      <w:r>
+        <w:br/>
+        <w:t xml:space="preserve">    z = 2</w:t>
+      </w:r>
+      <w:r>
+        <w:br/>
+      </w:r>
+      <w:proofErr w:type="spellStart"/>
+      <w:r>
+        <w:t>if</w:t>
+      </w:r>
+      <w:proofErr w:type="spellEnd"/>
+      <w:r>
+        <w:t xml:space="preserve"> z == 2 and tv2[2] == 2:</w:t>
+      </w:r>
+      <w:r>
+        <w:br/>
+        <w:t xml:space="preserve">    tv2[3] = 2</w:t>
+      </w:r>
+      <w:r>
+        <w:br/>
+      </w:r>
+      <w:proofErr w:type="spellStart"/>
+      <w:r>
+        <w:t>else</w:t>
+      </w:r>
+      <w:proofErr w:type="spellEnd"/>
+      <w:r>
+        <w:t>:</w:t>
+      </w:r>
+      <w:r>
+        <w:br/>
+        <w:t xml:space="preserve">    tv2[3] = 1</w:t>
+      </w:r>
+      <w:r>
+        <w:br/>
+      </w:r>
+      <w:proofErr w:type="spellStart"/>
+      <w:r>
+        <w:t>print</w:t>
+      </w:r>
+      <w:proofErr w:type="spellEnd"/>
+      <w:r>
+        <w:t>(tv2)</w:t>
+      </w:r>
+    </w:p>
+    <w:p/>
     <w:p/>
     <w:sectPr>
       <w:pgSz w:w="11906" w:h="16838"/>

</xml_diff>